<commit_message>
Add mid-semester report, 20-slide presentation, plain-language explainer, and viva Q&A
- 05_midsem_report: full signable report with all required sections (docx/pdf)
- 06_presentation: 20-slide deck (pptx/pdf) for the 10-minute presentation
- 07_what_we_are_doing: simple-language team explainer + glossary
- 08_viva_qa_prep: 55 likely questions with model answers
- Focus literature review down to 15 core papers with detailed per-paper summaries
- Add methodology pipeline, Gantt, and shared-subspace figures
- Reconcile reference numbering across all documents
</commit_message>
<xml_diff>
--- a/reports/00_README.docx
+++ b/reports/00_README.docx
@@ -2,7 +2,7 @@
 <file path=word/document.xml><?xml version="1.0" encoding="utf-8"?>
 <w:document xmlns:w="http://schemas.openxmlformats.org/wordprocessingml/2006/main" xmlns:m="http://schemas.openxmlformats.org/officeDocument/2006/math" xmlns:r="http://schemas.openxmlformats.org/officeDocument/2006/relationships" xmlns:o="urn:schemas-microsoft-com:office:office" xmlns:v="urn:schemas-microsoft-com:vml" xmlns:w10="urn:schemas-microsoft-com:office:word" xmlns:a="http://schemas.openxmlformats.org/drawingml/2006/main" xmlns:pic="http://schemas.openxmlformats.org/drawingml/2006/picture" xmlns:wp="http://schemas.openxmlformats.org/drawingml/2006/wordprocessingDrawing">
   <w:body>
-    <w:bookmarkStart w:id="17" w:name="X88a35a5e8b43a2c77d7fa64c3400357741e9a00"/>
+    <w:bookmarkStart w:id="24" w:name="X88a35a5e8b43a2c77d7fa64c3400357741e9a00"/>
     <w:p>
       <w:pPr>
         <w:pStyle w:val="Heading1"/>
@@ -38,16 +38,66 @@
         <w:t xml:space="preserve"> </w:t>
       </w:r>
       <w:r>
-        <w:t xml:space="preserve">metaheuristic/bio-inspired feature selection.</w:t>
+        <w:t xml:space="preserve">metaheuristic/bio-inspired optimization for transferable feature selection.</w:t>
       </w:r>
     </w:p>
-    <w:bookmarkStart w:id="13" w:name="document-set-for-mid-semester-review"/>
     <w:p>
       <w:pPr>
+        <w:pStyle w:val="BodyText"/>
+      </w:pPr>
+      <w:r>
+        <w:rPr>
+          <w:b/>
+          <w:bCs/>
+        </w:rPr>
+        <w:t xml:space="preserve">Team:</w:t>
+      </w:r>
+      <w:r>
+        <w:t xml:space="preserve"> </w:t>
+      </w:r>
+      <w:r>
+        <w:t xml:space="preserve">Shivam Chauhan (2023UIN3323), Deepesh (2023UIN3358), Shantanu Agarwal (2023UIN3330)</w:t>
+      </w:r>
+      <w:r>
+        <w:t xml:space="preserve"> </w:t>
+      </w:r>
+      <w:r>
+        <w:rPr>
+          <w:b/>
+          <w:bCs/>
+        </w:rPr>
+        <w:t xml:space="preserve">Supervisor:</w:t>
+      </w:r>
+      <w:r>
+        <w:t xml:space="preserve"> </w:t>
+      </w:r>
+      <w:r>
+        <w:t xml:space="preserve">Dr. Preeti Bansal — Department of Information Technology, NSUT</w:t>
+      </w:r>
+    </w:p>
+    <w:p>
+      <w:r>
+        <w:pict>
+          <v:rect style="width:0;height:1.5pt" o:hralign="center" o:hrstd="t" o:hr="t"/>
+        </w:pict>
+      </w:r>
+    </w:p>
+    <w:bookmarkStart w:id="20" w:name="document-set"/>
+    <w:p>
+      <w:pPr>
         <w:pStyle w:val="Heading2"/>
       </w:pPr>
       <w:r>
-        <w:t xml:space="preserve">Document set (for mid-semester review)</w:t>
+        <w:t xml:space="preserve">Document set</w:t>
+      </w:r>
+    </w:p>
+    <w:bookmarkStart w:id="11" w:name="submission-deliverables-mid-semester"/>
+    <w:p>
+      <w:pPr>
+        <w:pStyle w:val="Heading3"/>
+      </w:pPr>
+      <w:r>
+        <w:t xml:space="preserve">Submission deliverables (mid-semester)</w:t>
       </w:r>
     </w:p>
     <w:tbl>
@@ -112,6 +162,346 @@
                 <w:rPr>
                   <w:rStyle w:val="Hyperlink"/>
                 </w:rPr>
+                <w:t xml:space="preserve">05</w:t>
+              </w:r>
+            </w:hyperlink>
+          </w:p>
+        </w:tc>
+        <w:tc>
+          <w:tcPr/>
+          <w:p>
+            <w:pPr>
+              <w:pStyle w:val="Compact"/>
+            </w:pPr>
+            <w:r>
+              <w:rPr>
+                <w:b/>
+                <w:bCs/>
+              </w:rPr>
+              <w:t xml:space="preserve">Mid-Semester Report</w:t>
+            </w:r>
+            <w:r>
+              <w:t xml:space="preserve"> </w:t>
+            </w:r>
+            <w:r>
+              <w:t xml:space="preserve">(18 pp)</w:t>
+            </w:r>
+          </w:p>
+        </w:tc>
+        <w:tc>
+          <w:tcPr/>
+          <w:p>
+            <w:pPr>
+              <w:pStyle w:val="Compact"/>
+            </w:pPr>
+            <w:r>
+              <w:t xml:space="preserve">The signable report with all required sections (title page, abstract, introduction, motivation, literature survey, problem statement, objectives, methodology, implementation, results, conclusion, references).</w:t>
+            </w:r>
+          </w:p>
+        </w:tc>
+      </w:tr>
+      <w:tr>
+        <w:tc>
+          <w:tcPr/>
+          <w:p>
+            <w:pPr>
+              <w:pStyle w:val="Compact"/>
+            </w:pPr>
+            <w:hyperlink r:id="rId10">
+              <w:r>
+                <w:rPr>
+                  <w:rStyle w:val="Hyperlink"/>
+                </w:rPr>
+                <w:t xml:space="preserve">06</w:t>
+              </w:r>
+            </w:hyperlink>
+          </w:p>
+        </w:tc>
+        <w:tc>
+          <w:tcPr/>
+          <w:p>
+            <w:pPr>
+              <w:pStyle w:val="Compact"/>
+            </w:pPr>
+            <w:r>
+              <w:rPr>
+                <w:b/>
+                <w:bCs/>
+              </w:rPr>
+              <w:t xml:space="preserve">Presentation</w:t>
+            </w:r>
+            <w:r>
+              <w:t xml:space="preserve"> </w:t>
+            </w:r>
+            <w:r>
+              <w:t xml:space="preserve">(20 slides)</w:t>
+            </w:r>
+          </w:p>
+        </w:tc>
+        <w:tc>
+          <w:tcPr/>
+          <w:p>
+            <w:pPr>
+              <w:pStyle w:val="Compact"/>
+            </w:pPr>
+            <w:r>
+              <w:t xml:space="preserve">Slide deck for the 10-minute presentation. Exports:</w:t>
+            </w:r>
+            <w:r>
+              <w:t xml:space="preserve"> </w:t>
+            </w:r>
+            <w:r>
+              <w:rPr>
+                <w:rStyle w:val="VerbatimChar"/>
+              </w:rPr>
+              <w:t xml:space="preserve">.pptx</w:t>
+            </w:r>
+            <w:r>
+              <w:t xml:space="preserve"> </w:t>
+            </w:r>
+            <w:r>
+              <w:t xml:space="preserve">(editable),</w:t>
+            </w:r>
+            <w:r>
+              <w:t xml:space="preserve"> </w:t>
+            </w:r>
+            <w:r>
+              <w:rPr>
+                <w:rStyle w:val="VerbatimChar"/>
+              </w:rPr>
+              <w:t xml:space="preserve">.pdf</w:t>
+            </w:r>
+            <w:r>
+              <w:t xml:space="preserve"> </w:t>
+            </w:r>
+            <w:r>
+              <w:t xml:space="preserve">(handout).</w:t>
+            </w:r>
+          </w:p>
+        </w:tc>
+      </w:tr>
+    </w:tbl>
+    <w:bookmarkEnd w:id="11"/>
+    <w:bookmarkStart w:id="14" w:name="preparation-understanding"/>
+    <w:p>
+      <w:pPr>
+        <w:pStyle w:val="Heading3"/>
+      </w:pPr>
+      <w:r>
+        <w:t xml:space="preserve">Preparation / understanding</w:t>
+      </w:r>
+    </w:p>
+    <w:tbl>
+      <w:tblPr>
+        <w:tblStyle w:val="Table"/>
+        <w:tblW w:type="pct" w:w="5000"/>
+        <w:tblLayout w:type="fixed"/>
+        <w:tblLook w:firstRow="1" w:lastRow="0" w:firstColumn="0" w:lastColumn="0" w:noHBand="0" w:noVBand="0" w:val="0020"/>
+      </w:tblPr>
+      <w:tblGrid>
+        <w:gridCol w:w="2640"/>
+        <w:gridCol w:w="2640"/>
+        <w:gridCol w:w="2640"/>
+      </w:tblGrid>
+      <w:tr>
+        <w:trPr>
+          <w:tblHeader w:val="on"/>
+        </w:trPr>
+        <w:tc>
+          <w:tcPr/>
+          <w:p>
+            <w:pPr>
+              <w:pStyle w:val="Compact"/>
+            </w:pPr>
+            <w:r>
+              <w:t xml:space="preserve">#</w:t>
+            </w:r>
+          </w:p>
+        </w:tc>
+        <w:tc>
+          <w:tcPr/>
+          <w:p>
+            <w:pPr>
+              <w:pStyle w:val="Compact"/>
+            </w:pPr>
+            <w:r>
+              <w:t xml:space="preserve">Document</w:t>
+            </w:r>
+          </w:p>
+        </w:tc>
+        <w:tc>
+          <w:tcPr/>
+          <w:p>
+            <w:pPr>
+              <w:pStyle w:val="Compact"/>
+            </w:pPr>
+            <w:r>
+              <w:t xml:space="preserve">Purpose</w:t>
+            </w:r>
+          </w:p>
+        </w:tc>
+      </w:tr>
+      <w:tr>
+        <w:tc>
+          <w:tcPr/>
+          <w:p>
+            <w:pPr>
+              <w:pStyle w:val="Compact"/>
+            </w:pPr>
+            <w:hyperlink r:id="rId12">
+              <w:r>
+                <w:rPr>
+                  <w:rStyle w:val="Hyperlink"/>
+                </w:rPr>
+                <w:t xml:space="preserve">07</w:t>
+              </w:r>
+            </w:hyperlink>
+          </w:p>
+        </w:tc>
+        <w:tc>
+          <w:tcPr/>
+          <w:p>
+            <w:pPr>
+              <w:pStyle w:val="Compact"/>
+            </w:pPr>
+            <w:r>
+              <w:rPr>
+                <w:b/>
+                <w:bCs/>
+              </w:rPr>
+              <w:t xml:space="preserve">What We Are Doing (plain language)</w:t>
+            </w:r>
+          </w:p>
+        </w:tc>
+        <w:tc>
+          <w:tcPr/>
+          <w:p>
+            <w:pPr>
+              <w:pStyle w:val="Compact"/>
+            </w:pPr>
+            <w:r>
+              <w:t xml:space="preserve">Team explainer: the whole project in simple words, analogies, glossary.</w:t>
+            </w:r>
+          </w:p>
+        </w:tc>
+      </w:tr>
+      <w:tr>
+        <w:tc>
+          <w:tcPr/>
+          <w:p>
+            <w:pPr>
+              <w:pStyle w:val="Compact"/>
+            </w:pPr>
+            <w:hyperlink r:id="rId13">
+              <w:r>
+                <w:rPr>
+                  <w:rStyle w:val="Hyperlink"/>
+                </w:rPr>
+                <w:t xml:space="preserve">08</w:t>
+              </w:r>
+            </w:hyperlink>
+          </w:p>
+        </w:tc>
+        <w:tc>
+          <w:tcPr/>
+          <w:p>
+            <w:pPr>
+              <w:pStyle w:val="Compact"/>
+            </w:pPr>
+            <w:r>
+              <w:rPr>
+                <w:b/>
+                <w:bCs/>
+              </w:rPr>
+              <w:t xml:space="preserve">Viva Q&amp;A Prep</w:t>
+            </w:r>
+          </w:p>
+        </w:tc>
+        <w:tc>
+          <w:tcPr/>
+          <w:p>
+            <w:pPr>
+              <w:pStyle w:val="Compact"/>
+            </w:pPr>
+            <w:r>
+              <w:t xml:space="preserve">55 likely questions with model answers (including per-paper questions).</w:t>
+            </w:r>
+          </w:p>
+        </w:tc>
+      </w:tr>
+    </w:tbl>
+    <w:bookmarkEnd w:id="14"/>
+    <w:bookmarkStart w:id="19" w:name="supporting-analysis"/>
+    <w:p>
+      <w:pPr>
+        <w:pStyle w:val="Heading3"/>
+      </w:pPr>
+      <w:r>
+        <w:t xml:space="preserve">Supporting analysis</w:t>
+      </w:r>
+    </w:p>
+    <w:tbl>
+      <w:tblPr>
+        <w:tblStyle w:val="Table"/>
+        <w:tblW w:type="pct" w:w="5000"/>
+        <w:tblLayout w:type="fixed"/>
+        <w:tblLook w:firstRow="1" w:lastRow="0" w:firstColumn="0" w:lastColumn="0" w:noHBand="0" w:noVBand="0" w:val="0020"/>
+      </w:tblPr>
+      <w:tblGrid>
+        <w:gridCol w:w="2640"/>
+        <w:gridCol w:w="2640"/>
+        <w:gridCol w:w="2640"/>
+      </w:tblGrid>
+      <w:tr>
+        <w:trPr>
+          <w:tblHeader w:val="on"/>
+        </w:trPr>
+        <w:tc>
+          <w:tcPr/>
+          <w:p>
+            <w:pPr>
+              <w:pStyle w:val="Compact"/>
+            </w:pPr>
+            <w:r>
+              <w:t xml:space="preserve">#</w:t>
+            </w:r>
+          </w:p>
+        </w:tc>
+        <w:tc>
+          <w:tcPr/>
+          <w:p>
+            <w:pPr>
+              <w:pStyle w:val="Compact"/>
+            </w:pPr>
+            <w:r>
+              <w:t xml:space="preserve">Document</w:t>
+            </w:r>
+          </w:p>
+        </w:tc>
+        <w:tc>
+          <w:tcPr/>
+          <w:p>
+            <w:pPr>
+              <w:pStyle w:val="Compact"/>
+            </w:pPr>
+            <w:r>
+              <w:t xml:space="preserve">Purpose</w:t>
+            </w:r>
+          </w:p>
+        </w:tc>
+      </w:tr>
+      <w:tr>
+        <w:tc>
+          <w:tcPr/>
+          <w:p>
+            <w:pPr>
+              <w:pStyle w:val="Compact"/>
+            </w:pPr>
+            <w:hyperlink r:id="rId15">
+              <w:r>
+                <w:rPr>
+                  <w:rStyle w:val="Hyperlink"/>
+                </w:rPr>
                 <w:t xml:space="preserve">01</w:t>
               </w:r>
             </w:hyperlink>
@@ -135,7 +525,7 @@
               <w:pStyle w:val="Compact"/>
             </w:pPr>
             <w:r>
-              <w:t xml:space="preserve">First-hand analysis of the three datasets: provenance, features, class distributions, quality issues, feature-schema mismatch, and label-taxonomy mapping.</w:t>
+              <w:t xml:space="preserve">First-hand analysis of the three datasets, feature-schema mismatch, taxonomy mapping.</w:t>
             </w:r>
           </w:p>
         </w:tc>
@@ -147,7 +537,7 @@
             <w:pPr>
               <w:pStyle w:val="Compact"/>
             </w:pPr>
-            <w:hyperlink r:id="rId10">
+            <w:hyperlink r:id="rId16">
               <w:r>
                 <w:rPr>
                   <w:rStyle w:val="Hyperlink"/>
@@ -164,18 +554,18 @@
               <w:pStyle w:val="Compact"/>
             </w:pPr>
             <w:r>
-              <w:t xml:space="preserve">Literature Review</w:t>
-            </w:r>
-          </w:p>
-        </w:tc>
-        <w:tc>
-          <w:tcPr/>
-          <w:p>
-            <w:pPr>
-              <w:pStyle w:val="Compact"/>
-            </w:pPr>
-            <w:r>
-              <w:t xml:space="preserve">~33 papers across 4 themes, each summarised (problem/method/datasets/results/limitation), with a gap-synthesis table.</w:t>
+              <w:t xml:space="preserve">Literature Review (15 papers)</w:t>
+            </w:r>
+          </w:p>
+        </w:tc>
+        <w:tc>
+          <w:tcPr/>
+          <w:p>
+            <w:pPr>
+              <w:pStyle w:val="Compact"/>
+            </w:pPr>
+            <w:r>
+              <w:t xml:space="preserve">Focused review with detailed per-paper summaries and the gap-synthesis table.</w:t>
             </w:r>
           </w:p>
         </w:tc>
@@ -187,7 +577,7 @@
             <w:pPr>
               <w:pStyle w:val="Compact"/>
             </w:pPr>
-            <w:hyperlink r:id="rId11">
+            <w:hyperlink r:id="rId17">
               <w:r>
                 <w:rPr>
                   <w:rStyle w:val="Hyperlink"/>
@@ -215,7 +605,7 @@
               <w:pStyle w:val="Compact"/>
             </w:pPr>
             <w:r>
-              <w:t xml:space="preserve">Formal gap statements, novelty, 5 objectives, scope decisions, risks.</w:t>
+              <w:t xml:space="preserve">Formal gap statements, novelty, objectives, scope, risks.</w:t>
             </w:r>
           </w:p>
         </w:tc>
@@ -227,7 +617,7 @@
             <w:pPr>
               <w:pStyle w:val="Compact"/>
             </w:pPr>
-            <w:hyperlink r:id="rId12">
+            <w:hyperlink r:id="rId18">
               <w:r>
                 <w:rPr>
                   <w:rStyle w:val="Hyperlink"/>
@@ -244,18 +634,18 @@
               <w:pStyle w:val="Compact"/>
             </w:pPr>
             <w:r>
-              <w:t xml:space="preserve">Methodology &amp; Detailed Plan</w:t>
-            </w:r>
-          </w:p>
-        </w:tc>
-        <w:tc>
-          <w:tcPr/>
-          <w:p>
-            <w:pPr>
-              <w:pStyle w:val="Compact"/>
-            </w:pPr>
-            <w:r>
-              <w:t xml:space="preserve">7-phase plan, evaluation protocol, fitness-function design, baselines, timeline, success criteria.</w:t>
+              <w:t xml:space="preserve">Methodology &amp; Plan</w:t>
+            </w:r>
+          </w:p>
+        </w:tc>
+        <w:tc>
+          <w:tcPr/>
+          <w:p>
+            <w:pPr>
+              <w:pStyle w:val="Compact"/>
+            </w:pPr>
+            <w:r>
+              <w:t xml:space="preserve">7-phase plan, evaluation protocol, fitness-function design, timeline.</w:t>
             </w:r>
           </w:p>
         </w:tc>
@@ -266,7 +656,7 @@
         <w:pStyle w:val="BodyText"/>
       </w:pPr>
       <w:r>
-        <w:t xml:space="preserve">Figures referenced by the reports live in</w:t>
+        <w:t xml:space="preserve">Figures are in</w:t>
       </w:r>
       <w:r>
         <w:t xml:space="preserve"> </w:t>
@@ -278,17 +668,63 @@
         <w:t xml:space="preserve">figures/</w:t>
       </w:r>
       <w:r>
-        <w:t xml:space="preserve">.</w:t>
+        <w:t xml:space="preserve">. Each</w:t>
+      </w:r>
+      <w:r>
+        <w:t xml:space="preserve"> </w:t>
+      </w:r>
+      <w:r>
+        <w:rPr>
+          <w:rStyle w:val="VerbatimChar"/>
+        </w:rPr>
+        <w:t xml:space="preserve">.md</w:t>
+      </w:r>
+      <w:r>
+        <w:t xml:space="preserve"> </w:t>
+      </w:r>
+      <w:r>
+        <w:t xml:space="preserve">also has</w:t>
+      </w:r>
+      <w:r>
+        <w:t xml:space="preserve"> </w:t>
+      </w:r>
+      <w:r>
+        <w:rPr>
+          <w:rStyle w:val="VerbatimChar"/>
+        </w:rPr>
+        <w:t xml:space="preserve">.docx</w:t>
+      </w:r>
+      <w:r>
+        <w:t xml:space="preserve"> </w:t>
+      </w:r>
+      <w:r>
+        <w:t xml:space="preserve">and</w:t>
+      </w:r>
+      <w:r>
+        <w:t xml:space="preserve"> </w:t>
+      </w:r>
+      <w:r>
+        <w:rPr>
+          <w:rStyle w:val="VerbatimChar"/>
+        </w:rPr>
+        <w:t xml:space="preserve">.pdf</w:t>
+      </w:r>
+      <w:r>
+        <w:t xml:space="preserve"> </w:t>
+      </w:r>
+      <w:r>
+        <w:t xml:space="preserve">exports.</w:t>
       </w:r>
     </w:p>
-    <w:bookmarkEnd w:id="13"/>
-    <w:bookmarkStart w:id="14" w:name="supporting-artefacts"/>
+    <w:bookmarkEnd w:id="19"/>
+    <w:bookmarkEnd w:id="20"/>
+    <w:bookmarkStart w:id="21" w:name="supporting-code"/>
     <w:p>
       <w:pPr>
         <w:pStyle w:val="Heading2"/>
       </w:pPr>
       <w:r>
-        <w:t xml:space="preserve">Supporting artefacts</w:t>
+        <w:t xml:space="preserve">Supporting code</w:t>
       </w:r>
     </w:p>
     <w:p>
@@ -309,7 +745,7 @@
         <w:t xml:space="preserve"> </w:t>
       </w:r>
       <w:r>
-        <w:t xml:space="preserve">— computes dataset statistics from raw CSVs.</w:t>
+        <w:t xml:space="preserve">— computes dataset statistics from the raw CSVs.</w:t>
       </w:r>
     </w:p>
     <w:p>
@@ -345,7 +781,7 @@
         <w:t xml:space="preserve"> </w:t>
       </w:r>
       <w:r>
-        <w:t xml:space="preserve">and all figures.</w:t>
+        <w:t xml:space="preserve">and the class-distribution figures.</w:t>
       </w:r>
     </w:p>
     <w:p>
@@ -360,6 +796,27 @@
         <w:rPr>
           <w:rStyle w:val="VerbatimChar"/>
         </w:rPr>
+        <w:t xml:space="preserve">src/generate_extra_figures.py</w:t>
+      </w:r>
+      <w:r>
+        <w:t xml:space="preserve"> </w:t>
+      </w:r>
+      <w:r>
+        <w:t xml:space="preserve">— generates the pipeline, Gantt and shared-subspace figures.</w:t>
+      </w:r>
+    </w:p>
+    <w:p>
+      <w:pPr>
+        <w:pStyle w:val="Compact"/>
+        <w:numPr>
+          <w:ilvl w:val="0"/>
+          <w:numId w:val="1001"/>
+        </w:numPr>
+      </w:pPr>
+      <w:r>
+        <w:rPr>
+          <w:rStyle w:val="VerbatimChar"/>
+        </w:rPr>
         <w:t xml:space="preserve">src/dataset_stats.json</w:t>
       </w:r>
       <w:r>
@@ -369,14 +826,14 @@
         <w:t xml:space="preserve">— measured statistics (rows, class distributions, NaN/Inf counts).</w:t>
       </w:r>
     </w:p>
-    <w:bookmarkEnd w:id="14"/>
-    <w:bookmarkStart w:id="15" w:name="how-to-read-this-for-the-review"/>
+    <w:bookmarkEnd w:id="21"/>
+    <w:bookmarkStart w:id="22" w:name="X546f11242b24ca3c895bcb2b8a1f462f7de3b03"/>
     <w:p>
       <w:pPr>
         <w:pStyle w:val="Heading2"/>
       </w:pPr>
       <w:r>
-        <w:t xml:space="preserve">How to read this for the review</w:t>
+        <w:t xml:space="preserve">Quick facts (measured from the downloaded data)</w:t>
       </w:r>
     </w:p>
     <w:p>
@@ -388,32 +845,7 @@
         </w:numPr>
       </w:pPr>
       <w:r>
-        <w:t xml:space="preserve">Start with</w:t>
-      </w:r>
-      <w:r>
-        <w:t xml:space="preserve"> </w:t>
-      </w:r>
-      <w:r>
-        <w:rPr>
-          <w:b/>
-          <w:bCs/>
-        </w:rPr>
-        <w:t xml:space="preserve">03</w:t>
-      </w:r>
-      <w:r>
-        <w:t xml:space="preserve"> </w:t>
-      </w:r>
-      <w:r>
-        <w:t xml:space="preserve">(gaps + objectives) to see the</w:t>
-      </w:r>
-      <w:r>
-        <w:t xml:space="preserve"> </w:t>
-      </w:r>
-      <w:r>
-        <w:t xml:space="preserve">“why”</w:t>
-      </w:r>
-      <w:r>
-        <w:t xml:space="preserve">.</w:t>
+        <w:t xml:space="preserve">CIC-IDS-2017: 2,830,743 flows, 77 unique features, 80.3% benign, 1,358 NaN + 4,376 Inf cells.</w:t>
       </w:r>
     </w:p>
     <w:p>
@@ -425,11 +857,130 @@
         </w:numPr>
       </w:pPr>
       <w:r>
-        <w:t xml:space="preserve">Read</w:t>
+        <w:t xml:space="preserve">UNSW-NB15: 257,673 records, 42 features, 9 attack classes + Normal.</w:t>
+      </w:r>
+    </w:p>
+    <w:p>
+      <w:pPr>
+        <w:pStyle w:val="Compact"/>
+        <w:numPr>
+          <w:ilvl w:val="0"/>
+          <w:numId w:val="1002"/>
+        </w:numPr>
+      </w:pPr>
+      <w:r>
+        <w:t xml:space="preserve">TON_IoT: 211,043 records, 42 features, 10 attack classes (near-balanced).</w:t>
+      </w:r>
+    </w:p>
+    <w:p>
+      <w:pPr>
+        <w:pStyle w:val="Compact"/>
+        <w:numPr>
+          <w:ilvl w:val="0"/>
+          <w:numId w:val="1002"/>
+        </w:numPr>
+      </w:pPr>
+      <w:r>
+        <w:t xml:space="preserve">The three datasets share</w:t>
       </w:r>
       <w:r>
         <w:t xml:space="preserve"> </w:t>
       </w:r>
+      <w:r>
+        <w:rPr>
+          <w:b/>
+          <w:bCs/>
+        </w:rPr>
+        <w:t xml:space="preserve">no common column names</w:t>
+      </w:r>
+      <w:r>
+        <w:t xml:space="preserve">; only ~6 raw features are semantically alignable.</w:t>
+      </w:r>
+    </w:p>
+    <w:bookmarkEnd w:id="22"/>
+    <w:bookmarkStart w:id="23" w:name="how-to-read-this-for-the-review"/>
+    <w:p>
+      <w:pPr>
+        <w:pStyle w:val="Heading2"/>
+      </w:pPr>
+      <w:r>
+        <w:t xml:space="preserve">How to read this for the review</w:t>
+      </w:r>
+    </w:p>
+    <w:p>
+      <w:pPr>
+        <w:pStyle w:val="Compact"/>
+        <w:numPr>
+          <w:ilvl w:val="0"/>
+          <w:numId w:val="1003"/>
+        </w:numPr>
+      </w:pPr>
+      <w:r>
+        <w:t xml:space="preserve">Start with</w:t>
+      </w:r>
+      <w:r>
+        <w:t xml:space="preserve"> </w:t>
+      </w:r>
+      <w:r>
+        <w:rPr>
+          <w:b/>
+          <w:bCs/>
+        </w:rPr>
+        <w:t xml:space="preserve">07</w:t>
+      </w:r>
+      <w:r>
+        <w:t xml:space="preserve"> </w:t>
+      </w:r>
+      <w:r>
+        <w:t xml:space="preserve">(plain-language overview), then</w:t>
+      </w:r>
+      <w:r>
+        <w:t xml:space="preserve"> </w:t>
+      </w:r>
+      <w:r>
+        <w:rPr>
+          <w:b/>
+          <w:bCs/>
+        </w:rPr>
+        <w:t xml:space="preserve">05</w:t>
+      </w:r>
+      <w:r>
+        <w:t xml:space="preserve"> </w:t>
+      </w:r>
+      <w:r>
+        <w:t xml:space="preserve">(the report).</w:t>
+      </w:r>
+    </w:p>
+    <w:p>
+      <w:pPr>
+        <w:pStyle w:val="Compact"/>
+        <w:numPr>
+          <w:ilvl w:val="0"/>
+          <w:numId w:val="1003"/>
+        </w:numPr>
+      </w:pPr>
+      <w:r>
+        <w:rPr>
+          <w:b/>
+          <w:bCs/>
+        </w:rPr>
+        <w:t xml:space="preserve">08</w:t>
+      </w:r>
+      <w:r>
+        <w:t xml:space="preserve"> </w:t>
+      </w:r>
+      <w:r>
+        <w:t xml:space="preserve">for answering questions.</w:t>
+      </w:r>
+    </w:p>
+    <w:p>
+      <w:pPr>
+        <w:pStyle w:val="Compact"/>
+        <w:numPr>
+          <w:ilvl w:val="0"/>
+          <w:numId w:val="1003"/>
+        </w:numPr>
+      </w:pPr>
       <w:r>
         <w:rPr>
           <w:b/>
@@ -438,53 +989,7 @@
         <w:t xml:space="preserve">01</w:t>
       </w:r>
       <w:r>
-        <w:t xml:space="preserve"> </w:t>
-      </w:r>
-      <w:r>
-        <w:t xml:space="preserve">to understand the data and the central feature-mismatch problem.</w:t>
-      </w:r>
-    </w:p>
-    <w:p>
-      <w:pPr>
-        <w:pStyle w:val="Compact"/>
-        <w:numPr>
-          <w:ilvl w:val="0"/>
-          <w:numId w:val="1002"/>
-        </w:numPr>
-      </w:pPr>
-      <w:r>
-        <w:t xml:space="preserve">Read</w:t>
-      </w:r>
-      <w:r>
-        <w:t xml:space="preserve"> </w:t>
-      </w:r>
-      <w:r>
-        <w:rPr>
-          <w:b/>
-          <w:bCs/>
-        </w:rPr>
-        <w:t xml:space="preserve">02</w:t>
-      </w:r>
-      <w:r>
-        <w:t xml:space="preserve"> </w:t>
-      </w:r>
-      <w:r>
-        <w:t xml:space="preserve">for the literature context and the gap evidence.</w:t>
-      </w:r>
-    </w:p>
-    <w:p>
-      <w:pPr>
-        <w:pStyle w:val="Compact"/>
-        <w:numPr>
-          <w:ilvl w:val="0"/>
-          <w:numId w:val="1002"/>
-        </w:numPr>
-      </w:pPr>
-      <w:r>
-        <w:t xml:space="preserve">Read</w:t>
-      </w:r>
-      <w:r>
-        <w:t xml:space="preserve"> </w:t>
+        <w:t xml:space="preserve">–</w:t>
       </w:r>
       <w:r>
         <w:rPr>
@@ -497,88 +1002,11 @@
         <w:t xml:space="preserve"> </w:t>
       </w:r>
       <w:r>
-        <w:t xml:space="preserve">for exactly what we will build and when.</w:t>
+        <w:t xml:space="preserve">for the detailed analysis behind the report.</w:t>
       </w:r>
     </w:p>
-    <w:bookmarkEnd w:id="15"/>
-    <w:bookmarkStart w:id="16" w:name="X546f11242b24ca3c895bcb2b8a1f462f7de3b03"/>
-    <w:p>
-      <w:pPr>
-        <w:pStyle w:val="Heading2"/>
-      </w:pPr>
-      <w:r>
-        <w:t xml:space="preserve">Quick facts (measured from the downloaded data)</w:t>
-      </w:r>
-    </w:p>
-    <w:p>
-      <w:pPr>
-        <w:pStyle w:val="Compact"/>
-        <w:numPr>
-          <w:ilvl w:val="0"/>
-          <w:numId w:val="1003"/>
-        </w:numPr>
-      </w:pPr>
-      <w:r>
-        <w:t xml:space="preserve">CIC-IDS-2017: 2,830,743 flows, 77 unique features, 80.3% benign, 1,358 NaN + 4,376 Inf cells.</w:t>
-      </w:r>
-    </w:p>
-    <w:p>
-      <w:pPr>
-        <w:pStyle w:val="Compact"/>
-        <w:numPr>
-          <w:ilvl w:val="0"/>
-          <w:numId w:val="1003"/>
-        </w:numPr>
-      </w:pPr>
-      <w:r>
-        <w:t xml:space="preserve">UNSW-NB15: 257,673 records, 42 features, 9 attack classes + Normal.</w:t>
-      </w:r>
-    </w:p>
-    <w:p>
-      <w:pPr>
-        <w:pStyle w:val="Compact"/>
-        <w:numPr>
-          <w:ilvl w:val="0"/>
-          <w:numId w:val="1003"/>
-        </w:numPr>
-      </w:pPr>
-      <w:r>
-        <w:t xml:space="preserve">TON_IoT: 211,043 records, 42 features, 10 attack classes (near-balanced).</w:t>
-      </w:r>
-    </w:p>
-    <w:p>
-      <w:pPr>
-        <w:pStyle w:val="Compact"/>
-        <w:numPr>
-          <w:ilvl w:val="0"/>
-          <w:numId w:val="1003"/>
-        </w:numPr>
-      </w:pPr>
-      <w:r>
-        <w:t xml:space="preserve">The three datasets share</w:t>
-      </w:r>
-      <w:r>
-        <w:t xml:space="preserve"> </w:t>
-      </w:r>
-      <w:r>
-        <w:rPr>
-          <w:b/>
-          <w:bCs/>
-        </w:rPr>
-        <w:t xml:space="preserve">no common column names</w:t>
-      </w:r>
-      <w:r>
-        <w:t xml:space="preserve">; only ~15–25 features are semantically</w:t>
-      </w:r>
-      <w:r>
-        <w:t xml:space="preserve"> </w:t>
-      </w:r>
-      <w:r>
-        <w:t xml:space="preserve">alignable across all three.</w:t>
-      </w:r>
-    </w:p>
-    <w:bookmarkEnd w:id="16"/>
-    <w:bookmarkEnd w:id="17"/>
+    <w:bookmarkEnd w:id="23"/>
+    <w:bookmarkEnd w:id="24"/>
     <w:sectPr>
       <w:footnotePr>
         <w:numRestart w:val="eachSect"/>
@@ -884,6 +1312,9 @@
     <w:abstractNumId w:val="991"/>
   </w:num>
   <w:num w:numId="1002">
+    <w:abstractNumId w:val="991"/>
+  </w:num>
+  <w:num w:numId="1003">
     <w:abstractNumId w:val="99411"/>
     <w:lvlOverride w:ilvl="0">
       <w:startOverride w:val="1"/>
@@ -912,9 +1343,6 @@
     <w:lvlOverride w:ilvl="8">
       <w:startOverride w:val="1"/>
     </w:lvlOverride>
-  </w:num>
-  <w:num w:numId="1003">
-    <w:abstractNumId w:val="991"/>
   </w:num>
 </w:numbering>
 </file>

</xml_diff>

<commit_message>
Add baseline benchmark, DA-MFS optimisation, master context, and updated reports
Baseline: five ensemble models (RF, ExtraTrees, HistGB, XGBoost, soft-voting) trained on
the full datasets; same-dataset 0.96-0.97 but cross-dataset only 0.37-0.42 (balanced accuracy
0.46-0.49, near random), reproducing the generalisation gap.

DA-MFS (main contribution): domain alignment (per-dataset quantile transform) + GA/PSO
feature selection with a cross-dataset fitness. Improves cross-dataset accuracy 0.373 -> 0.508
(+13.6pp), balanced accuracy +10.4pp, macro-F1 +15.3pp, attack recall +12.8pp using 4 features.

Adds scripts (baseline_cross_dataset, aggregate_baseline, baseline_figures, metaheuristic_fs,
domain_aligned_fs, da_mfs_tables), results, figures, and MASTER_CONTEXT (md/txt/pdf).
Updates report (19pp), presentation (21 slides), explainer, and viva Q&A.
</commit_message>
<xml_diff>
--- a/reports/00_README.docx
+++ b/reports/00_README.docx
@@ -2,7 +2,7 @@
 <file path=word/document.xml><?xml version="1.0" encoding="utf-8"?>
 <w:document xmlns:w="http://schemas.openxmlformats.org/wordprocessingml/2006/main" xmlns:m="http://schemas.openxmlformats.org/officeDocument/2006/math" xmlns:r="http://schemas.openxmlformats.org/officeDocument/2006/relationships" xmlns:o="urn:schemas-microsoft-com:office:office" xmlns:v="urn:schemas-microsoft-com:vml" xmlns:w10="urn:schemas-microsoft-com:office:word" xmlns:a="http://schemas.openxmlformats.org/drawingml/2006/main" xmlns:pic="http://schemas.openxmlformats.org/drawingml/2006/picture" xmlns:wp="http://schemas.openxmlformats.org/drawingml/2006/wordprocessingDrawing">
   <w:body>
-    <w:bookmarkStart w:id="24" w:name="X88a35a5e8b43a2c77d7fa64c3400357741e9a00"/>
+    <w:bookmarkStart w:id="26" w:name="X88a35a5e8b43a2c77d7fa64c3400357741e9a00"/>
     <w:p>
       <w:pPr>
         <w:pStyle w:val="Heading1"/>
@@ -56,7 +56,7 @@
         <w:t xml:space="preserve"> </w:t>
       </w:r>
       <w:r>
-        <w:t xml:space="preserve">Shivam Chauhan (2023UIN3323), Deepesh (2023UIN3358), Shantanu Agarwal (2023UIN3330)</w:t>
+        <w:t xml:space="preserve">Shivam Chauhan (2023UIN3323), Shantanu Agarwal (2023UIN3330), Deepesh (2023UIN3358)</w:t>
       </w:r>
       <w:r>
         <w:t xml:space="preserve"> </w:t>
@@ -817,6 +817,152 @@
         <w:rPr>
           <w:rStyle w:val="VerbatimChar"/>
         </w:rPr>
+        <w:t xml:space="preserve">src/baseline_cross_dataset.py</w:t>
+      </w:r>
+      <w:r>
+        <w:t xml:space="preserve"> </w:t>
+      </w:r>
+      <w:r>
+        <w:t xml:space="preserve">— trains the baseline models and produces 3×3 cross-dataset metric matrices.</w:t>
+      </w:r>
+    </w:p>
+    <w:p>
+      <w:pPr>
+        <w:pStyle w:val="Compact"/>
+        <w:numPr>
+          <w:ilvl w:val="0"/>
+          <w:numId w:val="1001"/>
+        </w:numPr>
+      </w:pPr>
+      <w:r>
+        <w:rPr>
+          <w:rStyle w:val="VerbatimChar"/>
+        </w:rPr>
+        <w:t xml:space="preserve">src/aggregate_baseline.py</w:t>
+      </w:r>
+      <w:r>
+        <w:t xml:space="preserve"> </w:t>
+      </w:r>
+      <w:r>
+        <w:t xml:space="preserve">— aggregates per-model matrices into</w:t>
+      </w:r>
+      <w:r>
+        <w:t xml:space="preserve"> </w:t>
+      </w:r>
+      <w:r>
+        <w:rPr>
+          <w:rStyle w:val="VerbatimChar"/>
+        </w:rPr>
+        <w:t xml:space="preserve">results/baseline_summary.md</w:t>
+      </w:r>
+      <w:r>
+        <w:t xml:space="preserve">.</w:t>
+      </w:r>
+    </w:p>
+    <w:p>
+      <w:pPr>
+        <w:pStyle w:val="Compact"/>
+        <w:numPr>
+          <w:ilvl w:val="0"/>
+          <w:numId w:val="1001"/>
+        </w:numPr>
+      </w:pPr>
+      <w:r>
+        <w:rPr>
+          <w:rStyle w:val="VerbatimChar"/>
+        </w:rPr>
+        <w:t xml:space="preserve">src/baseline_figures.py</w:t>
+      </w:r>
+      <w:r>
+        <w:t xml:space="preserve"> </w:t>
+      </w:r>
+      <w:r>
+        <w:t xml:space="preserve">— generates the baseline-result figures.</w:t>
+      </w:r>
+    </w:p>
+    <w:p>
+      <w:pPr>
+        <w:pStyle w:val="Compact"/>
+        <w:numPr>
+          <w:ilvl w:val="0"/>
+          <w:numId w:val="1001"/>
+        </w:numPr>
+      </w:pPr>
+      <w:r>
+        <w:rPr>
+          <w:rStyle w:val="VerbatimChar"/>
+        </w:rPr>
+        <w:t xml:space="preserve">src/metaheuristic_fs.py</w:t>
+      </w:r>
+      <w:r>
+        <w:t xml:space="preserve"> </w:t>
+      </w:r>
+      <w:r>
+        <w:t xml:space="preserve">— GA + binary PSO with a</w:t>
+      </w:r>
+      <w:r>
+        <w:t xml:space="preserve"> </w:t>
+      </w:r>
+      <w:r>
+        <w:rPr>
+          <w:b/>
+          <w:bCs/>
+        </w:rPr>
+        <w:t xml:space="preserve">cross-dataset fitness</w:t>
+      </w:r>
+      <w:r>
+        <w:t xml:space="preserve"> </w:t>
+      </w:r>
+      <w:r>
+        <w:t xml:space="preserve">(raw-feature baseline attempt).</w:t>
+      </w:r>
+    </w:p>
+    <w:p>
+      <w:pPr>
+        <w:pStyle w:val="Compact"/>
+        <w:numPr>
+          <w:ilvl w:val="0"/>
+          <w:numId w:val="1001"/>
+        </w:numPr>
+      </w:pPr>
+      <w:r>
+        <w:rPr>
+          <w:rStyle w:val="VerbatimChar"/>
+        </w:rPr>
+        <w:t xml:space="preserve">src/domain_aligned_fs.py</w:t>
+      </w:r>
+      <w:r>
+        <w:t xml:space="preserve"> </w:t>
+      </w:r>
+      <w:r>
+        <w:t xml:space="preserve">—</w:t>
+      </w:r>
+      <w:r>
+        <w:t xml:space="preserve"> </w:t>
+      </w:r>
+      <w:r>
+        <w:rPr>
+          <w:b/>
+          <w:bCs/>
+        </w:rPr>
+        <w:t xml:space="preserve">DA-MFS</w:t>
+      </w:r>
+      <w:r>
+        <w:t xml:space="preserve">: domain alignment + GA/PSO feature selection (main result).</w:t>
+      </w:r>
+    </w:p>
+    <w:p>
+      <w:pPr>
+        <w:pStyle w:val="Compact"/>
+        <w:numPr>
+          <w:ilvl w:val="0"/>
+          <w:numId w:val="1001"/>
+        </w:numPr>
+      </w:pPr>
+      <w:r>
+        <w:rPr>
+          <w:rStyle w:val="VerbatimChar"/>
+        </w:rPr>
         <w:t xml:space="preserve">src/dataset_stats.json</w:t>
       </w:r>
       <w:r>
@@ -827,7 +973,775 @@
       </w:r>
     </w:p>
     <w:bookmarkEnd w:id="21"/>
-    <w:bookmarkStart w:id="22" w:name="X546f11242b24ca3c895bcb2b8a1f462f7de3b03"/>
+    <w:bookmarkStart w:id="22" w:name="baseline-result-full-datasets"/>
+    <w:p>
+      <w:pPr>
+        <w:pStyle w:val="Heading2"/>
+      </w:pPr>
+      <w:r>
+        <w:t xml:space="preserve">Baseline result (full datasets)</w:t>
+      </w:r>
+    </w:p>
+    <w:p>
+      <w:pPr>
+        <w:pStyle w:val="FirstParagraph"/>
+      </w:pPr>
+      <w:r>
+        <w:t xml:space="preserve">Five ensemble models trained on the</w:t>
+      </w:r>
+      <w:r>
+        <w:t xml:space="preserve"> </w:t>
+      </w:r>
+      <w:r>
+        <w:rPr>
+          <w:b/>
+          <w:bCs/>
+        </w:rPr>
+        <w:t xml:space="preserve">entire</w:t>
+      </w:r>
+      <w:r>
+        <w:t xml:space="preserve"> </w:t>
+      </w:r>
+      <w:r>
+        <w:t xml:space="preserve">datasets:</w:t>
+      </w:r>
+    </w:p>
+    <w:tbl>
+      <w:tblPr>
+        <w:tblStyle w:val="Table"/>
+        <w:tblW w:type="auto" w:w="0"/>
+        <w:tblLook w:firstRow="1" w:lastRow="0" w:firstColumn="0" w:lastColumn="0" w:noHBand="0" w:noVBand="0" w:val="0020"/>
+      </w:tblPr>
+      <w:tblGrid>
+        <w:gridCol w:w="1980"/>
+        <w:gridCol w:w="1980"/>
+        <w:gridCol w:w="1980"/>
+        <w:gridCol w:w="1980"/>
+      </w:tblGrid>
+      <w:tr>
+        <w:trPr>
+          <w:tblHeader w:val="on"/>
+        </w:trPr>
+        <w:tc>
+          <w:tcPr/>
+          <w:p>
+            <w:pPr>
+              <w:pStyle w:val="Compact"/>
+            </w:pPr>
+            <w:r>
+              <w:t xml:space="preserve">Model</w:t>
+            </w:r>
+          </w:p>
+        </w:tc>
+        <w:tc>
+          <w:tcPr/>
+          <w:p>
+            <w:pPr>
+              <w:pStyle w:val="Compact"/>
+            </w:pPr>
+            <w:r>
+              <w:t xml:space="preserve">Same-dataset Acc</w:t>
+            </w:r>
+          </w:p>
+        </w:tc>
+        <w:tc>
+          <w:tcPr/>
+          <w:p>
+            <w:pPr>
+              <w:pStyle w:val="Compact"/>
+            </w:pPr>
+            <w:r>
+              <w:t xml:space="preserve">Cross-dataset Acc</w:t>
+            </w:r>
+          </w:p>
+        </w:tc>
+        <w:tc>
+          <w:tcPr/>
+          <w:p>
+            <w:pPr>
+              <w:pStyle w:val="Compact"/>
+            </w:pPr>
+            <w:r>
+              <w:t xml:space="preserve">Cross-dataset Bal-Acc</w:t>
+            </w:r>
+          </w:p>
+        </w:tc>
+      </w:tr>
+      <w:tr>
+        <w:tc>
+          <w:tcPr/>
+          <w:p>
+            <w:pPr>
+              <w:pStyle w:val="Compact"/>
+            </w:pPr>
+            <w:r>
+              <w:t xml:space="preserve">Random Forest</w:t>
+            </w:r>
+          </w:p>
+        </w:tc>
+        <w:tc>
+          <w:tcPr/>
+          <w:p>
+            <w:pPr>
+              <w:pStyle w:val="Compact"/>
+            </w:pPr>
+            <w:r>
+              <w:t xml:space="preserve">0.9666</w:t>
+            </w:r>
+          </w:p>
+        </w:tc>
+        <w:tc>
+          <w:tcPr/>
+          <w:p>
+            <w:pPr>
+              <w:pStyle w:val="Compact"/>
+            </w:pPr>
+            <w:r>
+              <w:t xml:space="preserve">0.3726</w:t>
+            </w:r>
+          </w:p>
+        </w:tc>
+        <w:tc>
+          <w:tcPr/>
+          <w:p>
+            <w:pPr>
+              <w:pStyle w:val="Compact"/>
+            </w:pPr>
+            <w:r>
+              <w:t xml:space="preserve">0.4650</w:t>
+            </w:r>
+          </w:p>
+        </w:tc>
+      </w:tr>
+      <w:tr>
+        <w:tc>
+          <w:tcPr/>
+          <w:p>
+            <w:pPr>
+              <w:pStyle w:val="Compact"/>
+            </w:pPr>
+            <w:r>
+              <w:t xml:space="preserve">XGBoost</w:t>
+            </w:r>
+          </w:p>
+        </w:tc>
+        <w:tc>
+          <w:tcPr/>
+          <w:p>
+            <w:pPr>
+              <w:pStyle w:val="Compact"/>
+            </w:pPr>
+            <w:r>
+              <w:t xml:space="preserve">0.9622</w:t>
+            </w:r>
+          </w:p>
+        </w:tc>
+        <w:tc>
+          <w:tcPr/>
+          <w:p>
+            <w:pPr>
+              <w:pStyle w:val="Compact"/>
+            </w:pPr>
+            <w:r>
+              <w:t xml:space="preserve">0.4150</w:t>
+            </w:r>
+          </w:p>
+        </w:tc>
+        <w:tc>
+          <w:tcPr/>
+          <w:p>
+            <w:pPr>
+              <w:pStyle w:val="Compact"/>
+            </w:pPr>
+            <w:r>
+              <w:t xml:space="preserve">0.4760</w:t>
+            </w:r>
+          </w:p>
+        </w:tc>
+      </w:tr>
+      <w:tr>
+        <w:tc>
+          <w:tcPr/>
+          <w:p>
+            <w:pPr>
+              <w:pStyle w:val="Compact"/>
+            </w:pPr>
+            <w:r>
+              <w:t xml:space="preserve">Hist. Grad. Boosting</w:t>
+            </w:r>
+          </w:p>
+        </w:tc>
+        <w:tc>
+          <w:tcPr/>
+          <w:p>
+            <w:pPr>
+              <w:pStyle w:val="Compact"/>
+            </w:pPr>
+            <w:r>
+              <w:t xml:space="preserve">0.9638</w:t>
+            </w:r>
+          </w:p>
+        </w:tc>
+        <w:tc>
+          <w:tcPr/>
+          <w:p>
+            <w:pPr>
+              <w:pStyle w:val="Compact"/>
+            </w:pPr>
+            <w:r>
+              <w:t xml:space="preserve">0.4179</w:t>
+            </w:r>
+          </w:p>
+        </w:tc>
+        <w:tc>
+          <w:tcPr/>
+          <w:p>
+            <w:pPr>
+              <w:pStyle w:val="Compact"/>
+            </w:pPr>
+            <w:r>
+              <w:t xml:space="preserve">0.4941</w:t>
+            </w:r>
+          </w:p>
+        </w:tc>
+      </w:tr>
+      <w:tr>
+        <w:tc>
+          <w:tcPr/>
+          <w:p>
+            <w:pPr>
+              <w:pStyle w:val="Compact"/>
+            </w:pPr>
+            <w:r>
+              <w:t xml:space="preserve">Extra Trees</w:t>
+            </w:r>
+          </w:p>
+        </w:tc>
+        <w:tc>
+          <w:tcPr/>
+          <w:p>
+            <w:pPr>
+              <w:pStyle w:val="Compact"/>
+            </w:pPr>
+            <w:r>
+              <w:t xml:space="preserve">0.9602</w:t>
+            </w:r>
+          </w:p>
+        </w:tc>
+        <w:tc>
+          <w:tcPr/>
+          <w:p>
+            <w:pPr>
+              <w:pStyle w:val="Compact"/>
+            </w:pPr>
+            <w:r>
+              <w:t xml:space="preserve">0.4027</w:t>
+            </w:r>
+          </w:p>
+        </w:tc>
+        <w:tc>
+          <w:tcPr/>
+          <w:p>
+            <w:pPr>
+              <w:pStyle w:val="Compact"/>
+            </w:pPr>
+            <w:r>
+              <w:t xml:space="preserve">0.4672</w:t>
+            </w:r>
+          </w:p>
+        </w:tc>
+      </w:tr>
+      <w:tr>
+        <w:tc>
+          <w:tcPr/>
+          <w:p>
+            <w:pPr>
+              <w:pStyle w:val="Compact"/>
+            </w:pPr>
+            <w:r>
+              <w:t xml:space="preserve">Soft-voting</w:t>
+            </w:r>
+          </w:p>
+        </w:tc>
+        <w:tc>
+          <w:tcPr/>
+          <w:p>
+            <w:pPr>
+              <w:pStyle w:val="Compact"/>
+            </w:pPr>
+            <w:r>
+              <w:t xml:space="preserve">0.9656</w:t>
+            </w:r>
+          </w:p>
+        </w:tc>
+        <w:tc>
+          <w:tcPr/>
+          <w:p>
+            <w:pPr>
+              <w:pStyle w:val="Compact"/>
+            </w:pPr>
+            <w:r>
+              <w:t xml:space="preserve">0.3968</w:t>
+            </w:r>
+          </w:p>
+        </w:tc>
+        <w:tc>
+          <w:tcPr/>
+          <w:p>
+            <w:pPr>
+              <w:pStyle w:val="Compact"/>
+            </w:pPr>
+            <w:r>
+              <w:t xml:space="preserve">0.4624</w:t>
+            </w:r>
+          </w:p>
+        </w:tc>
+      </w:tr>
+    </w:tbl>
+    <w:p>
+      <w:pPr>
+        <w:pStyle w:val="BodyText"/>
+      </w:pPr>
+      <w:r>
+        <w:t xml:space="preserve">Cross-dataset balanced accuracy ≈ 0.46–0.49 (random chance = 0.50), reproducing the</w:t>
+      </w:r>
+      <w:r>
+        <w:t xml:space="preserve"> </w:t>
+      </w:r>
+      <w:r>
+        <w:t xml:space="preserve">generalisation gap of [1], [2].</w:t>
+      </w:r>
+    </w:p>
+    <w:bookmarkEnd w:id="22"/>
+    <w:bookmarkStart w:id="23" w:name="X02cb4de6dc600b1a971f86878965eaa937c59fe"/>
+    <w:p>
+      <w:pPr>
+        <w:pStyle w:val="Heading2"/>
+      </w:pPr>
+      <w:r>
+        <w:t xml:space="preserve">DA-MFS optimisation result (main contribution)</w:t>
+      </w:r>
+    </w:p>
+    <w:p>
+      <w:pPr>
+        <w:pStyle w:val="FirstParagraph"/>
+      </w:pPr>
+      <w:r>
+        <w:t xml:space="preserve">Plain feature selection on raw features barely helps, because the same feature has a different</w:t>
+      </w:r>
+      <w:r>
+        <w:t xml:space="preserve"> </w:t>
+      </w:r>
+      <w:r>
+        <w:t xml:space="preserve">distribution in each dataset.</w:t>
+      </w:r>
+      <w:r>
+        <w:t xml:space="preserve"> </w:t>
+      </w:r>
+      <w:r>
+        <w:rPr>
+          <w:b/>
+          <w:bCs/>
+        </w:rPr>
+        <w:t xml:space="preserve">DA-MFS</w:t>
+      </w:r>
+      <w:r>
+        <w:t xml:space="preserve"> </w:t>
+      </w:r>
+      <w:r>
+        <w:t xml:space="preserve">first aligns each dataset’s feature marginals (per-dataset</w:t>
+      </w:r>
+      <w:r>
+        <w:t xml:space="preserve"> </w:t>
+      </w:r>
+      <w:r>
+        <w:t xml:space="preserve">quantile transform → normal) and then uses a Genetic Algorithm with a</w:t>
+      </w:r>
+      <w:r>
+        <w:t xml:space="preserve"> </w:t>
+      </w:r>
+      <w:r>
+        <w:rPr>
+          <w:b/>
+          <w:bCs/>
+        </w:rPr>
+        <w:t xml:space="preserve">cross-dataset fitness</w:t>
+      </w:r>
+      <w:r>
+        <w:t xml:space="preserve"> </w:t>
+      </w:r>
+      <w:r>
+        <w:t xml:space="preserve">to</w:t>
+      </w:r>
+      <w:r>
+        <w:t xml:space="preserve"> </w:t>
+      </w:r>
+      <w:r>
+        <w:t xml:space="preserve">select a transferable subset. Full-data cross-dataset results (mean over 6 train→test pairs):</w:t>
+      </w:r>
+    </w:p>
+    <w:tbl>
+      <w:tblPr>
+        <w:tblStyle w:val="Table"/>
+        <w:tblW w:type="pct" w:w="5000"/>
+        <w:tblLayout w:type="fixed"/>
+        <w:tblLook w:firstRow="1" w:lastRow="0" w:firstColumn="0" w:lastColumn="0" w:noHBand="0" w:noVBand="0" w:val="0020"/>
+      </w:tblPr>
+      <w:tblGrid>
+        <w:gridCol w:w="1584"/>
+        <w:gridCol w:w="1584"/>
+        <w:gridCol w:w="1584"/>
+        <w:gridCol w:w="1584"/>
+        <w:gridCol w:w="1584"/>
+      </w:tblGrid>
+      <w:tr>
+        <w:trPr>
+          <w:tblHeader w:val="on"/>
+        </w:trPr>
+        <w:tc>
+          <w:tcPr/>
+          <w:p>
+            <w:pPr>
+              <w:pStyle w:val="Compact"/>
+            </w:pPr>
+            <w:r>
+              <w:t xml:space="preserve">Configuration</w:t>
+            </w:r>
+          </w:p>
+        </w:tc>
+        <w:tc>
+          <w:tcPr/>
+          <w:p>
+            <w:pPr>
+              <w:pStyle w:val="Compact"/>
+            </w:pPr>
+            <w:r>
+              <w:t xml:space="preserve">Accuracy</w:t>
+            </w:r>
+          </w:p>
+        </w:tc>
+        <w:tc>
+          <w:tcPr/>
+          <w:p>
+            <w:pPr>
+              <w:pStyle w:val="Compact"/>
+            </w:pPr>
+            <w:r>
+              <w:t xml:space="preserve">Balanced acc</w:t>
+            </w:r>
+          </w:p>
+        </w:tc>
+        <w:tc>
+          <w:tcPr/>
+          <w:p>
+            <w:pPr>
+              <w:pStyle w:val="Compact"/>
+            </w:pPr>
+            <w:r>
+              <w:t xml:space="preserve">Macro-F1</w:t>
+            </w:r>
+          </w:p>
+        </w:tc>
+        <w:tc>
+          <w:tcPr/>
+          <w:p>
+            <w:pPr>
+              <w:pStyle w:val="Compact"/>
+            </w:pPr>
+            <w:r>
+              <w:t xml:space="preserve">Attack recall</w:t>
+            </w:r>
+          </w:p>
+        </w:tc>
+      </w:tr>
+      <w:tr>
+        <w:tc>
+          <w:tcPr/>
+          <w:p>
+            <w:pPr>
+              <w:pStyle w:val="Compact"/>
+            </w:pPr>
+            <w:r>
+              <w:t xml:space="preserve">Raw, all 12 features</w:t>
+            </w:r>
+          </w:p>
+        </w:tc>
+        <w:tc>
+          <w:tcPr/>
+          <w:p>
+            <w:pPr>
+              <w:pStyle w:val="Compact"/>
+            </w:pPr>
+            <w:r>
+              <w:t xml:space="preserve">0.3726</w:t>
+            </w:r>
+          </w:p>
+        </w:tc>
+        <w:tc>
+          <w:tcPr/>
+          <w:p>
+            <w:pPr>
+              <w:pStyle w:val="Compact"/>
+            </w:pPr>
+            <w:r>
+              <w:t xml:space="preserve">0.4650</w:t>
+            </w:r>
+          </w:p>
+        </w:tc>
+        <w:tc>
+          <w:tcPr/>
+          <w:p>
+            <w:pPr>
+              <w:pStyle w:val="Compact"/>
+            </w:pPr>
+            <w:r>
+              <w:t xml:space="preserve">0.3076</w:t>
+            </w:r>
+          </w:p>
+        </w:tc>
+        <w:tc>
+          <w:tcPr/>
+          <w:p>
+            <w:pPr>
+              <w:pStyle w:val="Compact"/>
+            </w:pPr>
+            <w:r>
+              <w:t xml:space="preserve">0.4789</w:t>
+            </w:r>
+          </w:p>
+        </w:tc>
+      </w:tr>
+      <w:tr>
+        <w:tc>
+          <w:tcPr/>
+          <w:p>
+            <w:pPr>
+              <w:pStyle w:val="Compact"/>
+            </w:pPr>
+            <w:r>
+              <w:t xml:space="preserve">Aligned, all 12 features</w:t>
+            </w:r>
+          </w:p>
+        </w:tc>
+        <w:tc>
+          <w:tcPr/>
+          <w:p>
+            <w:pPr>
+              <w:pStyle w:val="Compact"/>
+            </w:pPr>
+            <w:r>
+              <w:t xml:space="preserve">0.4776</w:t>
+            </w:r>
+          </w:p>
+        </w:tc>
+        <w:tc>
+          <w:tcPr/>
+          <w:p>
+            <w:pPr>
+              <w:pStyle w:val="Compact"/>
+            </w:pPr>
+            <w:r>
+              <w:t xml:space="preserve">0.5298</w:t>
+            </w:r>
+          </w:p>
+        </w:tc>
+        <w:tc>
+          <w:tcPr/>
+          <w:p>
+            <w:pPr>
+              <w:pStyle w:val="Compact"/>
+            </w:pPr>
+            <w:r>
+              <w:t xml:space="preserve">0.3845</w:t>
+            </w:r>
+          </w:p>
+        </w:tc>
+        <w:tc>
+          <w:tcPr/>
+          <w:p>
+            <w:pPr>
+              <w:pStyle w:val="Compact"/>
+            </w:pPr>
+            <w:r>
+              <w:t xml:space="preserve">0.6614</w:t>
+            </w:r>
+          </w:p>
+        </w:tc>
+      </w:tr>
+      <w:tr>
+        <w:tc>
+          <w:tcPr/>
+          <w:p>
+            <w:pPr>
+              <w:pStyle w:val="Compact"/>
+            </w:pPr>
+            <w:r>
+              <w:rPr>
+                <w:b/>
+                <w:bCs/>
+              </w:rPr>
+              <w:t xml:space="preserve">DA-MFS</w:t>
+            </w:r>
+            <w:r>
+              <w:t xml:space="preserve"> </w:t>
+            </w:r>
+            <w:r>
+              <w:t xml:space="preserve">(aligned + 4 selected)</w:t>
+            </w:r>
+          </w:p>
+        </w:tc>
+        <w:tc>
+          <w:tcPr/>
+          <w:p>
+            <w:pPr>
+              <w:pStyle w:val="Compact"/>
+            </w:pPr>
+            <w:r>
+              <w:rPr>
+                <w:b/>
+                <w:bCs/>
+              </w:rPr>
+              <w:t xml:space="preserve">0.5083</w:t>
+            </w:r>
+          </w:p>
+        </w:tc>
+        <w:tc>
+          <w:tcPr/>
+          <w:p>
+            <w:pPr>
+              <w:pStyle w:val="Compact"/>
+            </w:pPr>
+            <w:r>
+              <w:rPr>
+                <w:b/>
+                <w:bCs/>
+              </w:rPr>
+              <w:t xml:space="preserve">0.5689</w:t>
+            </w:r>
+          </w:p>
+        </w:tc>
+        <w:tc>
+          <w:tcPr/>
+          <w:p>
+            <w:pPr>
+              <w:pStyle w:val="Compact"/>
+            </w:pPr>
+            <w:r>
+              <w:rPr>
+                <w:b/>
+                <w:bCs/>
+              </w:rPr>
+              <w:t xml:space="preserve">0.4604</w:t>
+            </w:r>
+          </w:p>
+        </w:tc>
+        <w:tc>
+          <w:tcPr/>
+          <w:p>
+            <w:pPr>
+              <w:pStyle w:val="Compact"/>
+            </w:pPr>
+            <w:r>
+              <w:rPr>
+                <w:b/>
+                <w:bCs/>
+              </w:rPr>
+              <w:t xml:space="preserve">0.6065</w:t>
+            </w:r>
+          </w:p>
+        </w:tc>
+      </w:tr>
+    </w:tbl>
+    <w:p>
+      <w:pPr>
+        <w:pStyle w:val="BodyText"/>
+      </w:pPr>
+      <w:r>
+        <w:rPr>
+          <w:b/>
+          <w:bCs/>
+        </w:rPr>
+        <w:t xml:space="preserve">Improvement over raw baseline:</w:t>
+      </w:r>
+      <w:r>
+        <w:t xml:space="preserve"> </w:t>
+      </w:r>
+      <w:r>
+        <w:t xml:space="preserve">accuracy</w:t>
+      </w:r>
+      <w:r>
+        <w:t xml:space="preserve"> </w:t>
+      </w:r>
+      <w:r>
+        <w:rPr>
+          <w:b/>
+          <w:bCs/>
+        </w:rPr>
+        <w:t xml:space="preserve">+13.6 pp</w:t>
+      </w:r>
+      <w:r>
+        <w:t xml:space="preserve">, balanced accuracy</w:t>
+      </w:r>
+      <w:r>
+        <w:t xml:space="preserve"> </w:t>
+      </w:r>
+      <w:r>
+        <w:rPr>
+          <w:b/>
+          <w:bCs/>
+        </w:rPr>
+        <w:t xml:space="preserve">+10.4 pp</w:t>
+      </w:r>
+      <w:r>
+        <w:t xml:space="preserve">,</w:t>
+      </w:r>
+      <w:r>
+        <w:t xml:space="preserve"> </w:t>
+      </w:r>
+      <w:r>
+        <w:t xml:space="preserve">macro-F1</w:t>
+      </w:r>
+      <w:r>
+        <w:t xml:space="preserve"> </w:t>
+      </w:r>
+      <w:r>
+        <w:rPr>
+          <w:b/>
+          <w:bCs/>
+        </w:rPr>
+        <w:t xml:space="preserve">+15.3 pp</w:t>
+      </w:r>
+      <w:r>
+        <w:t xml:space="preserve">, attack recall</w:t>
+      </w:r>
+      <w:r>
+        <w:t xml:space="preserve"> </w:t>
+      </w:r>
+      <w:r>
+        <w:rPr>
+          <w:b/>
+          <w:bCs/>
+        </w:rPr>
+        <w:t xml:space="preserve">+12.8 pp</w:t>
+      </w:r>
+      <w:r>
+        <w:t xml:space="preserve">. Selected features:</w:t>
+      </w:r>
+      <w:r>
+        <w:t xml:space="preserve"> </w:t>
+      </w:r>
+      <w:r>
+        <w:rPr>
+          <w:rStyle w:val="VerbatimChar"/>
+        </w:rPr>
+        <w:t xml:space="preserve">duration, src_pkts, total_bytes, total_bytes_per_pkt</w:t>
+      </w:r>
+      <w:r>
+        <w:t xml:space="preserve">.</w:t>
+      </w:r>
+    </w:p>
+    <w:bookmarkEnd w:id="23"/>
+    <w:bookmarkStart w:id="24" w:name="X546f11242b24ca3c895bcb2b8a1f462f7de3b03"/>
     <w:p>
       <w:pPr>
         <w:pStyle w:val="Heading2"/>
@@ -897,8 +1811,8 @@
         <w:t xml:space="preserve">; only ~6 raw features are semantically alignable.</w:t>
       </w:r>
     </w:p>
-    <w:bookmarkEnd w:id="22"/>
-    <w:bookmarkStart w:id="23" w:name="how-to-read-this-for-the-review"/>
+    <w:bookmarkEnd w:id="24"/>
+    <w:bookmarkStart w:id="25" w:name="how-to-read-this-for-the-review"/>
     <w:p>
       <w:pPr>
         <w:pStyle w:val="Heading2"/>
@@ -1005,8 +1919,8 @@
         <w:t xml:space="preserve">for the detailed analysis behind the report.</w:t>
       </w:r>
     </w:p>
-    <w:bookmarkEnd w:id="23"/>
-    <w:bookmarkEnd w:id="24"/>
+    <w:bookmarkEnd w:id="25"/>
+    <w:bookmarkEnd w:id="26"/>
     <w:sectPr>
       <w:footnotePr>
         <w:numRestart w:val="eachSect"/>

</xml_diff>